<commit_message>
docs: choix du modèle décidé après benchmark (CDC, présentation, archi, CLAUDE)
- Reformulation : benchmark (logistique, Random Forest, LightGBM/XGBoost)
  puis sélection du modèle final selon les résultats (MLflow)
- Régénération du .docx de présentation

Co-Authored-By: Claude Opus 4.8 <noreply@anthropic.com>
</commit_message>
<xml_diff>
--- a/docs/Jack Lecomte.docx
+++ b/docs/Jack Lecomte.docx
@@ -2729,127 +2729,208 @@
           <w:b/>
           <w:bCs/>
         </w:rPr>
-        <w:t xml:space="preserve">Algorithme adapté.</w:t>
-      </w:r>
-      <w:r>
-        <w:t xml:space="preserve"> </w:t>
-      </w:r>
-      <w:r>
-        <w:t xml:space="preserve">Un modèle</w:t>
-      </w:r>
-      <w:r>
-        <w:t xml:space="preserve"> </w:t>
-      </w:r>
-      <w:r>
-        <w:rPr>
-          <w:b/>
-          <w:bCs/>
-        </w:rPr>
-        <w:t xml:space="preserve">LightGBM</w:t>
-      </w:r>
-      <w:r>
-        <w:t xml:space="preserve"> </w:t>
-      </w:r>
-      <w:r>
-        <w:t xml:space="preserve">(avec une régression logistique en baseline) réalise la</w:t>
-      </w:r>
-      <w:r>
-        <w:t xml:space="preserve"> </w:t>
-      </w:r>
-      <w:r>
-        <w:rPr>
-          <w:b/>
-          <w:bCs/>
-        </w:rPr>
-        <w:t xml:space="preserve">classification binaire</w:t>
-      </w:r>
-      <w:r>
+        <w:t xml:space="preserve">Algorithme — démarche de benchmark.</w:t>
+      </w:r>
+      <w:r>
+        <w:t xml:space="preserve"> </w:t>
+      </w:r>
+      <w:r>
+        <w:t xml:space="preserve">Plusieurs modèles seront</w:t>
+      </w:r>
+      <w:r>
+        <w:t xml:space="preserve"> </w:t>
+      </w:r>
+      <w:r>
+        <w:rPr>
+          <w:b/>
+          <w:bCs/>
+        </w:rPr>
+        <w:t xml:space="preserve">comparés</w:t>
+      </w:r>
+      <w:r>
+        <w:t xml:space="preserve"> </w:t>
+      </w:r>
+      <w:r>
+        <w:t xml:space="preserve">sur les mêmes métriques : régression logistique (</w:t>
+      </w:r>
+      <w:r>
+        <w:rPr>
+          <w:i/>
+          <w:iCs/>
+        </w:rPr>
+        <w:t xml:space="preserve">baseline</w:t>
+      </w:r>
+      <w:r>
+        <w:t xml:space="preserve">), Random Forest, et des modèles de</w:t>
+      </w:r>
+      <w:r>
+        <w:t xml:space="preserve"> </w:t>
+      </w:r>
+      <w:r>
+        <w:rPr>
+          <w:i/>
+          <w:iCs/>
+        </w:rPr>
+        <w:t xml:space="preserve">gradient boosting</w:t>
+      </w:r>
+      <w:r>
+        <w:t xml:space="preserve"> </w:t>
+      </w:r>
+      <w:r>
+        <w:t xml:space="preserve">(LightGBM, XGBoost), avec suivi des expériences dans</w:t>
+      </w:r>
+      <w:r>
+        <w:t xml:space="preserve"> </w:t>
+      </w:r>
+      <w:r>
+        <w:rPr>
+          <w:b/>
+          <w:bCs/>
+        </w:rPr>
+        <w:t xml:space="preserve">MLflow</w:t>
+      </w:r>
+      <w:r>
+        <w:t xml:space="preserve">. Le</w:t>
+      </w:r>
+      <w:r>
+        <w:t xml:space="preserve"> </w:t>
+      </w:r>
+      <w:r>
+        <w:rPr>
+          <w:b/>
+          <w:bCs/>
+        </w:rPr>
+        <w:t xml:space="preserve">modèle final sera retenu en fonction des résultats</w:t>
+      </w:r>
+      <w:r>
+        <w:t xml:space="preserve"> </w:t>
+      </w:r>
+      <w:r>
+        <w:t xml:space="preserve">— priorité au</w:t>
+      </w:r>
+      <w:r>
+        <w:t xml:space="preserve"> </w:t>
+      </w:r>
+      <w:r>
+        <w:rPr>
+          <w:b/>
+          <w:bCs/>
+        </w:rPr>
+        <w:t xml:space="preserve">recall de la classe</w:t>
+      </w:r>
+      <w:r>
+        <w:rPr>
+          <w:b/>
+          <w:bCs/>
+        </w:rPr>
         <w:t xml:space="preserve"> </w:t>
       </w:r>
       <w:r>
         <w:rPr>
           <w:rStyle w:val="VerbatimChar"/>
+          <w:b/>
+          <w:bCs/>
         </w:rPr>
         <w:t xml:space="preserve">grave</w:t>
       </w:r>
       <w:r>
-        <w:t xml:space="preserve"> </w:t>
-      </w:r>
-      <w:r>
-        <w:t xml:space="preserve">/</w:t>
-      </w:r>
-      <w:r>
-        <w:t xml:space="preserve"> </w:t>
+        <w:rPr>
+          <w:b/>
+          <w:bCs/>
+        </w:rPr>
+        <w:t xml:space="preserve"> </w:t>
+      </w:r>
+      <w:r>
+        <w:rPr>
+          <w:b/>
+          <w:bCs/>
+        </w:rPr>
+        <w:t xml:space="preserve">≥ 0,80</w:t>
+      </w:r>
+      <w:r>
+        <w:t xml:space="preserve"> </w:t>
+      </w:r>
+      <w:r>
+        <w:t xml:space="preserve">(ne pas manquer un cas grave), puis F1 macro et PR-AUC, sous contrainte d’explicabilité (SHAP). Le gradient boosting est anticipé comme favori sur ces données</w:t>
+      </w:r>
+      <w:r>
+        <w:t xml:space="preserve"> </w:t>
+      </w:r>
+      <w:r>
+        <w:rPr>
+          <w:b/>
+          <w:bCs/>
+        </w:rPr>
+        <w:t xml:space="preserve">tabulaires déséquilibrées</w:t>
+      </w:r>
+      <w:r>
+        <w:t xml:space="preserve">, mais le choix ne sera arrêté qu’</w:t>
+      </w:r>
+      <w:r>
+        <w:rPr>
+          <w:b/>
+          <w:bCs/>
+        </w:rPr>
+        <w:t xml:space="preserve">après le benchmark</w:t>
+      </w:r>
+      <w:r>
+        <w:t xml:space="preserve">.</w:t>
+      </w:r>
+    </w:p>
+    <w:p>
+      <w:pPr>
+        <w:pStyle w:val="BodyText"/>
+      </w:pPr>
+      <w:r>
+        <w:rPr>
+          <w:b/>
+          <w:bCs/>
+        </w:rPr>
+        <w:t xml:space="preserve">Intégration.</w:t>
+      </w:r>
+      <w:r>
+        <w:t xml:space="preserve"> </w:t>
+      </w:r>
+      <w:r>
+        <w:t xml:space="preserve">Exposition via une</w:t>
+      </w:r>
+      <w:r>
+        <w:t xml:space="preserve"> </w:t>
+      </w:r>
+      <w:r>
+        <w:rPr>
+          <w:b/>
+          <w:bCs/>
+        </w:rPr>
+        <w:t xml:space="preserve">API FastAPI</w:t>
+      </w:r>
+      <w:r>
+        <w:t xml:space="preserve"> </w:t>
+      </w:r>
+      <w:r>
+        <w:t xml:space="preserve">(</w:t>
       </w:r>
       <w:r>
         <w:rPr>
           <w:rStyle w:val="VerbatimChar"/>
         </w:rPr>
-        <w:t xml:space="preserve">non grave</w:t>
-      </w:r>
-      <w:r>
-        <w:t xml:space="preserve">. Ce choix est justifié par l’efficacité du gradient boosting sur des données</w:t>
-      </w:r>
-      <w:r>
-        <w:t xml:space="preserve"> </w:t>
-      </w:r>
-      <w:r>
-        <w:rPr>
-          <w:b/>
-          <w:bCs/>
-        </w:rPr>
-        <w:t xml:space="preserve">tabulaires déséquilibrées</w:t>
-      </w:r>
-      <w:r>
-        <w:t xml:space="preserve"> </w:t>
-      </w:r>
-      <w:r>
-        <w:t xml:space="preserve">(pondération des classes), sa rapidité et son explicabilité ; un modèle profond serait inadapté à ce type et ce volume de données. Métriques retenues :</w:t>
-      </w:r>
-      <w:r>
-        <w:t xml:space="preserve"> </w:t>
-      </w:r>
-      <w:r>
-        <w:rPr>
-          <w:b/>
-          <w:bCs/>
-        </w:rPr>
-        <w:t xml:space="preserve">recall de la classe</w:t>
-      </w:r>
-      <w:r>
-        <w:rPr>
-          <w:b/>
-          <w:bCs/>
-        </w:rPr>
-        <w:t xml:space="preserve"> </w:t>
-      </w:r>
-      <w:r>
-        <w:rPr>
-          <w:rStyle w:val="VerbatimChar"/>
-          <w:b/>
-          <w:bCs/>
-        </w:rPr>
-        <w:t xml:space="preserve">grave</w:t>
-      </w:r>
-      <w:r>
-        <w:rPr>
-          <w:b/>
-          <w:bCs/>
-        </w:rPr>
-        <w:t xml:space="preserve"> </w:t>
-      </w:r>
-      <w:r>
-        <w:rPr>
-          <w:b/>
-          <w:bCs/>
-        </w:rPr>
-        <w:t xml:space="preserve">≥ 0,80</w:t>
-      </w:r>
-      <w:r>
-        <w:t xml:space="preserve"> </w:t>
-      </w:r>
-      <w:r>
-        <w:t xml:space="preserve">(ne pas manquer un cas grave est prioritaire), F1 macro, PR-AUC.</w:t>
+        <w:t xml:space="preserve">/v1/predict-severity</w:t>
+      </w:r>
+      <w:r>
+        <w:t xml:space="preserve">) renvoyant un score, une classe et une</w:t>
+      </w:r>
+      <w:r>
+        <w:t xml:space="preserve"> </w:t>
+      </w:r>
+      <w:r>
+        <w:rPr>
+          <w:b/>
+          <w:bCs/>
+        </w:rPr>
+        <w:t xml:space="preserve">explication SHAP</w:t>
+      </w:r>
+      <w:r>
+        <w:t xml:space="preserve">, avec gestion des erreurs et sécurisation des accès, compatible avec l’infrastructure existante.</w:t>
       </w:r>
     </w:p>
     <w:p>
@@ -2861,51 +2942,45 @@
           <w:b/>
           <w:bCs/>
         </w:rPr>
-        <w:t xml:space="preserve">Intégration.</w:t>
-      </w:r>
-      <w:r>
-        <w:t xml:space="preserve"> </w:t>
-      </w:r>
-      <w:r>
-        <w:t xml:space="preserve">Exposition via une</w:t>
-      </w:r>
-      <w:r>
-        <w:t xml:space="preserve"> </w:t>
-      </w:r>
-      <w:r>
-        <w:rPr>
-          <w:b/>
-          <w:bCs/>
-        </w:rPr>
-        <w:t xml:space="preserve">API FastAPI</w:t>
-      </w:r>
-      <w:r>
-        <w:t xml:space="preserve"> </w:t>
-      </w:r>
-      <w:r>
-        <w:t xml:space="preserve">(</w:t>
-      </w:r>
-      <w:r>
-        <w:rPr>
-          <w:rStyle w:val="VerbatimChar"/>
-        </w:rPr>
-        <w:t xml:space="preserve">/v1/predict-severity</w:t>
-      </w:r>
-      <w:r>
-        <w:t xml:space="preserve">) renvoyant un score, une classe et une</w:t>
-      </w:r>
-      <w:r>
-        <w:t xml:space="preserve"> </w:t>
-      </w:r>
-      <w:r>
-        <w:rPr>
-          <w:b/>
-          <w:bCs/>
-        </w:rPr>
-        <w:t xml:space="preserve">explication SHAP</w:t>
-      </w:r>
-      <w:r>
-        <w:t xml:space="preserve">, avec gestion des erreurs et sécurisation des accès, compatible avec l’infrastructure existante.</w:t>
+        <w:t xml:space="preserve">CI/CD.</w:t>
+      </w:r>
+      <w:r>
+        <w:t xml:space="preserve"> </w:t>
+      </w:r>
+      <w:r>
+        <w:t xml:space="preserve">Pipeline</w:t>
+      </w:r>
+      <w:r>
+        <w:t xml:space="preserve"> </w:t>
+      </w:r>
+      <w:r>
+        <w:rPr>
+          <w:b/>
+          <w:bCs/>
+        </w:rPr>
+        <w:t xml:space="preserve">GitHub Actions</w:t>
+      </w:r>
+      <w:r>
+        <w:t xml:space="preserve"> </w:t>
+      </w:r>
+      <w:r>
+        <w:t xml:space="preserve">automatisé de bout en bout (tests, lint, build, déploiement) avec</w:t>
+      </w:r>
+      <w:r>
+        <w:t xml:space="preserve"> </w:t>
+      </w:r>
+      <w:r>
+        <w:rPr>
+          <w:b/>
+          <w:bCs/>
+        </w:rPr>
+        <w:t xml:space="preserve">gestion des versions</w:t>
+      </w:r>
+      <w:r>
+        <w:t xml:space="preserve"> </w:t>
+      </w:r>
+      <w:r>
+        <w:t xml:space="preserve">du code, des données et des modèles (MLflow).</w:t>
       </w:r>
     </w:p>
     <w:p>
@@ -2917,45 +2992,61 @@
           <w:b/>
           <w:bCs/>
         </w:rPr>
-        <w:t xml:space="preserve">CI/CD.</w:t>
-      </w:r>
-      <w:r>
-        <w:t xml:space="preserve"> </w:t>
-      </w:r>
-      <w:r>
-        <w:t xml:space="preserve">Pipeline</w:t>
-      </w:r>
-      <w:r>
-        <w:t xml:space="preserve"> </w:t>
-      </w:r>
-      <w:r>
-        <w:rPr>
-          <w:b/>
-          <w:bCs/>
-        </w:rPr>
-        <w:t xml:space="preserve">GitHub Actions</w:t>
-      </w:r>
-      <w:r>
-        <w:t xml:space="preserve"> </w:t>
-      </w:r>
-      <w:r>
-        <w:t xml:space="preserve">automatisé de bout en bout (tests, lint, build, déploiement) avec</w:t>
-      </w:r>
-      <w:r>
-        <w:t xml:space="preserve"> </w:t>
-      </w:r>
-      <w:r>
-        <w:rPr>
-          <w:b/>
-          <w:bCs/>
-        </w:rPr>
-        <w:t xml:space="preserve">gestion des versions</w:t>
-      </w:r>
-      <w:r>
-        <w:t xml:space="preserve"> </w:t>
-      </w:r>
-      <w:r>
-        <w:t xml:space="preserve">du code, des données et des modèles (MLflow).</w:t>
+        <w:t xml:space="preserve">Réentraînement et dérive.</w:t>
+      </w:r>
+      <w:r>
+        <w:t xml:space="preserve"> </w:t>
+      </w:r>
+      <w:r>
+        <w:t xml:space="preserve">Scripts de</w:t>
+      </w:r>
+      <w:r>
+        <w:t xml:space="preserve"> </w:t>
+      </w:r>
+      <w:r>
+        <w:rPr>
+          <w:b/>
+          <w:bCs/>
+        </w:rPr>
+        <w:t xml:space="preserve">réentraînement automatique</w:t>
+      </w:r>
+      <w:r>
+        <w:t xml:space="preserve"> </w:t>
+      </w:r>
+      <w:r>
+        <w:t xml:space="preserve">(nouveau millésime ou détection de dérive), reproductibles (graines fixées, versioning).</w:t>
+      </w:r>
+      <w:r>
+        <w:t xml:space="preserve"> </w:t>
+      </w:r>
+      <w:r>
+        <w:rPr>
+          <w:b/>
+          <w:bCs/>
+        </w:rPr>
+        <w:t xml:space="preserve">Détection de dérive</w:t>
+      </w:r>
+      <w:r>
+        <w:t xml:space="preserve"> </w:t>
+      </w:r>
+      <w:r>
+        <w:t xml:space="preserve">(data drift) via</w:t>
+      </w:r>
+      <w:r>
+        <w:t xml:space="preserve"> </w:t>
+      </w:r>
+      <w:r>
+        <w:rPr>
+          <w:b/>
+          <w:bCs/>
+        </w:rPr>
+        <w:t xml:space="preserve">Evidently</w:t>
+      </w:r>
+      <w:r>
+        <w:t xml:space="preserve"> </w:t>
+      </w:r>
+      <w:r>
+        <w:t xml:space="preserve">(PSI &lt; 0,2 comme seuil de déclenchement).</w:t>
       </w:r>
     </w:p>
     <w:p>
@@ -2967,61 +3058,13 @@
           <w:b/>
           <w:bCs/>
         </w:rPr>
-        <w:t xml:space="preserve">Réentraînement et dérive.</w:t>
-      </w:r>
-      <w:r>
-        <w:t xml:space="preserve"> </w:t>
-      </w:r>
-      <w:r>
-        <w:t xml:space="preserve">Scripts de</w:t>
-      </w:r>
-      <w:r>
-        <w:t xml:space="preserve"> </w:t>
-      </w:r>
-      <w:r>
-        <w:rPr>
-          <w:b/>
-          <w:bCs/>
-        </w:rPr>
-        <w:t xml:space="preserve">réentraînement automatique</w:t>
-      </w:r>
-      <w:r>
-        <w:t xml:space="preserve"> </w:t>
-      </w:r>
-      <w:r>
-        <w:t xml:space="preserve">(nouveau millésime ou détection de dérive), reproductibles (graines fixées, versioning).</w:t>
-      </w:r>
-      <w:r>
-        <w:t xml:space="preserve"> </w:t>
-      </w:r>
-      <w:r>
-        <w:rPr>
-          <w:b/>
-          <w:bCs/>
-        </w:rPr>
-        <w:t xml:space="preserve">Détection de dérive</w:t>
-      </w:r>
-      <w:r>
-        <w:t xml:space="preserve"> </w:t>
-      </w:r>
-      <w:r>
-        <w:t xml:space="preserve">(data drift) via</w:t>
-      </w:r>
-      <w:r>
-        <w:t xml:space="preserve"> </w:t>
-      </w:r>
-      <w:r>
-        <w:rPr>
-          <w:b/>
-          <w:bCs/>
-        </w:rPr>
-        <w:t xml:space="preserve">Evidently</w:t>
-      </w:r>
-      <w:r>
-        <w:t xml:space="preserve"> </w:t>
-      </w:r>
-      <w:r>
-        <w:t xml:space="preserve">(PSI &lt; 0,2 comme seuil de déclenchement).</w:t>
+        <w:t xml:space="preserve">Monitoring en production.</w:t>
+      </w:r>
+      <w:r>
+        <w:t xml:space="preserve"> </w:t>
+      </w:r>
+      <w:r>
+        <w:t xml:space="preserve">Suivi des performances et de la latence, alertes proactives, vérification du respect des spécifications.</w:t>
       </w:r>
     </w:p>
     <w:p>
@@ -3033,24 +3076,6 @@
           <w:b/>
           <w:bCs/>
         </w:rPr>
-        <w:t xml:space="preserve">Monitoring en production.</w:t>
-      </w:r>
-      <w:r>
-        <w:t xml:space="preserve"> </w:t>
-      </w:r>
-      <w:r>
-        <w:t xml:space="preserve">Suivi des performances et de la latence, alertes proactives, vérification du respect des spécifications.</w:t>
-      </w:r>
-    </w:p>
-    <w:p>
-      <w:pPr>
-        <w:pStyle w:val="BodyText"/>
-      </w:pPr>
-      <w:r>
-        <w:rPr>
-          <w:b/>
-          <w:bCs/>
-        </w:rPr>
         <w:t xml:space="preserve">Conformité et éthique.</w:t>
       </w:r>
       <w:r>
@@ -3139,49 +3164,55 @@
         <w:t xml:space="preserve"> </w:t>
       </w:r>
       <w:r>
-        <w:rPr>
-          <w:b/>
-          <w:bCs/>
-        </w:rPr>
-        <w:t xml:space="preserve">LightGBM</w:t>
-      </w:r>
-      <w:r>
-        <w:t xml:space="preserve"> </w:t>
-      </w:r>
-      <w:r>
-        <w:t xml:space="preserve">a été préféré à un réseau de neurones profond : sur des données</w:t>
-      </w:r>
-      <w:r>
-        <w:t xml:space="preserve"> </w:t>
-      </w:r>
-      <w:r>
-        <w:rPr>
-          <w:b/>
-          <w:bCs/>
-        </w:rPr>
-        <w:t xml:space="preserve">tabulaires</w:t>
-      </w:r>
-      <w:r>
-        <w:t xml:space="preserve"> </w:t>
-      </w:r>
-      <w:r>
-        <w:t xml:space="preserve">de ce volume, le gradient boosting est plus performant, plus rapide à entraîner et surtout plus</w:t>
-      </w:r>
-      <w:r>
-        <w:t xml:space="preserve"> </w:t>
-      </w:r>
-      <w:r>
-        <w:rPr>
-          <w:b/>
-          <w:bCs/>
-        </w:rPr>
-        <w:t xml:space="preserve">explicable</w:t>
-      </w:r>
-      <w:r>
-        <w:t xml:space="preserve"> </w:t>
-      </w:r>
-      <w:r>
-        <w:t xml:space="preserve">(compatibilité naturelle avec SHAP) — or l’explicabilité est ici une exigence réglementaire. Un modèle profond n’apporterait pas de gain de performance et complexifierait la justification éthique.</w:t>
+        <w:t xml:space="preserve">Le choix du modèle est</w:t>
+      </w:r>
+      <w:r>
+        <w:t xml:space="preserve"> </w:t>
+      </w:r>
+      <w:r>
+        <w:rPr>
+          <w:b/>
+          <w:bCs/>
+        </w:rPr>
+        <w:t xml:space="preserve">différé au résultat d’un benchmark</w:t>
+      </w:r>
+      <w:r>
+        <w:t xml:space="preserve"> </w:t>
+      </w:r>
+      <w:r>
+        <w:t xml:space="preserve">plutôt qu’arrêté a priori : c’est plus rigoureux et reproductible (comparaison tracée dans MLflow). Un</w:t>
+      </w:r>
+      <w:r>
+        <w:t xml:space="preserve"> </w:t>
+      </w:r>
+      <w:r>
+        <w:rPr>
+          <w:b/>
+          <w:bCs/>
+        </w:rPr>
+        <w:t xml:space="preserve">modèle profond est néanmoins écarté d’emblée</w:t>
+      </w:r>
+      <w:r>
+        <w:t xml:space="preserve"> </w:t>
+      </w:r>
+      <w:r>
+        <w:t xml:space="preserve">: sur des données tabulaires de ce volume il n’apporterait pas de gain et nuirait à l’explicabilité, exigence réglementaire ici. La famille</w:t>
+      </w:r>
+      <w:r>
+        <w:t xml:space="preserve"> </w:t>
+      </w:r>
+      <w:r>
+        <w:rPr>
+          <w:b/>
+          <w:bCs/>
+        </w:rPr>
+        <w:t xml:space="preserve">gradient boosting</w:t>
+      </w:r>
+      <w:r>
+        <w:t xml:space="preserve"> </w:t>
+      </w:r>
+      <w:r>
+        <w:t xml:space="preserve">est privilégiée a priori pour sa performance sur tabulaire déséquilibré et sa compatibilité naturelle avec SHAP, mais la décision finale dépendra des métriques mesurées.</w:t>
       </w:r>
     </w:p>
     <w:p>

</xml_diff>